<commit_message>
fix(ventas): formato de las plantillas de sociedad como el individual
"en forma personal" sin subrayado, la cláusula CUARTA del reconocimiento con
sólo el título subrayado, la viñeta chica de Word en vez del "●" de Google
Docs, y sin el espacio con fondo rosado que quedó en el reconocimiento.

Co-Authored-By: Claude Opus 5.5 <noreply@anthropic.com>
</commit_message>
<xml_diff>
--- a/apps/legal-docs-blueprints/templates/ventas_sociedad/carta_traspaso_vehiculo_rdbe_sociedad/carta_traspaso_vehiculo_rdbe_sociedad-mujer.docx
+++ b/apps/legal-docs-blueprints/templates/ventas_sociedad/carta_traspaso_vehiculo_rdbe_sociedad/carta_traspaso_vehiculo_rdbe_sociedad-mujer.docx
@@ -672,7 +672,6 @@
           <w:bCs w:val="1"/>
           <w:sz w:val="20"/>
           <w:szCs w:val="20"/>
-          <w:u w:val="single"/>
           <w:rtl w:val="0"/>
         </w:rPr>
         <w:t xml:space="preserve">en forma personal</w:t>
@@ -1897,13 +1896,13 @@
     <w:lvl w:ilvl="0">
       <w:start w:val="1"/>
       <w:numFmt w:val="bullet"/>
-      <w:lvlText w:val="●"/>
+      <w:lvlText w:val=""/>
       <w:lvlJc w:val="left"/>
       <w:pPr>
         <w:ind w:left="720" w:hanging="360"/>
       </w:pPr>
       <w:rPr>
-        <w:rFonts w:ascii="Helvetica Neue" w:cs="Helvetica Neue" w:eastAsia="Helvetica Neue" w:hAnsi="Helvetica Neue"/>
+        <w:rFonts w:ascii="Symbol" w:hAnsi="Symbol" w:cs="Symbol" w:hint="default"/>
         <w:b w:val="0"/>
         <w:bCs w:val="0"/>
         <w:i w:val="0"/>
@@ -1954,13 +1953,13 @@
     <w:lvl w:ilvl="3">
       <w:start w:val="1"/>
       <w:numFmt w:val="bullet"/>
-      <w:lvlText w:val="●"/>
+      <w:lvlText w:val=""/>
       <w:lvlJc w:val="left"/>
       <w:pPr>
         <w:ind w:left="2880" w:hanging="360"/>
       </w:pPr>
       <w:rPr>
-        <w:rFonts w:ascii="Helvetica Neue" w:cs="Helvetica Neue" w:eastAsia="Helvetica Neue" w:hAnsi="Helvetica Neue"/>
+        <w:rFonts w:ascii="Symbol" w:hAnsi="Symbol" w:cs="Symbol" w:hint="default"/>
         <w:b w:val="0"/>
         <w:bCs w:val="0"/>
         <w:i w:val="0"/>
@@ -2011,13 +2010,13 @@
     <w:lvl w:ilvl="6">
       <w:start w:val="1"/>
       <w:numFmt w:val="bullet"/>
-      <w:lvlText w:val="●"/>
+      <w:lvlText w:val=""/>
       <w:lvlJc w:val="left"/>
       <w:pPr>
         <w:ind w:left="5040" w:hanging="360"/>
       </w:pPr>
       <w:rPr>
-        <w:rFonts w:ascii="Helvetica Neue" w:cs="Helvetica Neue" w:eastAsia="Helvetica Neue" w:hAnsi="Helvetica Neue"/>
+        <w:rFonts w:ascii="Symbol" w:hAnsi="Symbol" w:cs="Symbol" w:hint="default"/>
         <w:b w:val="0"/>
         <w:bCs w:val="0"/>
         <w:i w:val="0"/>

</xml_diff>